<commit_message>
Add Tóm tắt and Mở đầu sections
</commit_message>
<xml_diff>
--- a/IE203.F33.CN2.CNTT_Nhom14_Quy trình nghiệp vụ hệ thống đặt lịch sửa chữa thiết bị _File báo cáo.docx
+++ b/IE203.F33.CN2.CNTT_Nhom14_Quy trình nghiệp vụ hệ thống đặt lịch sửa chữa thiết bị _File báo cáo.docx
@@ -7408,14 +7408,14 @@
         </w:rPr>
         <w:fldChar w:fldCharType="separate"/>
       </w:r>
-      <w:hyperlink w:anchor="_Toc239103033" w:history="1">
+      <w:hyperlink w:anchor="_Toc239454468" w:history="1">
         <w:r>
           <w:rPr>
             <w:rStyle w:val="Hyperlink"/>
             <w:rFonts w:ascii="Times New Roman" w:hAnsi="Times New Roman" w:cs="Times New Roman"/>
             <w:noProof/>
           </w:rPr>
-          <w:t>Bảng 2.1. Độ phức tạp quy trình - Quản lý KTV</w:t>
+          <w:t>Bảng 2.1. Độ phức tạp quy trình – Quản lý KTV</w:t>
         </w:r>
         <w:r>
           <w:rPr>
@@ -7436,7 +7436,7 @@
             <w:noProof/>
             <w:webHidden/>
           </w:rPr>
-          <w:instrText xml:space="preserve"> PAGEREF _Toc239103033 \h </w:instrText>
+          <w:instrText xml:space="preserve"> PAGEREF _Toc239454468 \h </w:instrText>
         </w:r>
         <w:r>
           <w:rPr>
@@ -7456,7 +7456,7 @@
             <w:noProof/>
             <w:webHidden/>
           </w:rPr>
-          <w:t>23</w:t>
+          <w:t>24</w:t>
         </w:r>
         <w:r>
           <w:rPr>
@@ -7483,7 +7483,7 @@
           <w14:ligatures w14:val="standardContextual"/>
         </w:rPr>
       </w:pPr>
-      <w:hyperlink w:anchor="_Toc239103034" w:history="1">
+      <w:hyperlink w:anchor="_Toc239454469" w:history="1">
         <w:r>
           <w:rPr>
             <w:rStyle w:val="Hyperlink"/>
@@ -7511,7 +7511,7 @@
             <w:noProof/>
             <w:webHidden/>
           </w:rPr>
-          <w:instrText xml:space="preserve"> PAGEREF _Toc239103034 \h </w:instrText>
+          <w:instrText xml:space="preserve"> PAGEREF _Toc239454469 \h </w:instrText>
         </w:r>
         <w:r>
           <w:rPr>
@@ -7531,7 +7531,7 @@
             <w:noProof/>
             <w:webHidden/>
           </w:rPr>
-          <w:t>25</w:t>
+          <w:t>26</w:t>
         </w:r>
         <w:r>
           <w:rPr>
@@ -7558,7 +7558,7 @@
           <w14:ligatures w14:val="standardContextual"/>
         </w:rPr>
       </w:pPr>
-      <w:hyperlink w:anchor="_Toc239103035" w:history="1">
+      <w:hyperlink w:anchor="_Toc239454470" w:history="1">
         <w:r>
           <w:rPr>
             <w:rStyle w:val="Hyperlink"/>
@@ -7586,7 +7586,7 @@
             <w:noProof/>
             <w:webHidden/>
           </w:rPr>
-          <w:instrText xml:space="preserve"> PAGEREF _Toc239103035 \h </w:instrText>
+          <w:instrText xml:space="preserve"> PAGEREF _Toc239454470 \h </w:instrText>
         </w:r>
         <w:r>
           <w:rPr>
@@ -7606,7 +7606,7 @@
             <w:noProof/>
             <w:webHidden/>
           </w:rPr>
-          <w:t>26</w:t>
+          <w:t>27</w:t>
         </w:r>
         <w:r>
           <w:rPr>
@@ -7633,7 +7633,7 @@
           <w14:ligatures w14:val="standardContextual"/>
         </w:rPr>
       </w:pPr>
-      <w:hyperlink w:anchor="_Toc239103036" w:history="1">
+      <w:hyperlink w:anchor="_Toc239454471" w:history="1">
         <w:r>
           <w:rPr>
             <w:rStyle w:val="Hyperlink"/>
@@ -7661,7 +7661,7 @@
             <w:noProof/>
             <w:webHidden/>
           </w:rPr>
-          <w:instrText xml:space="preserve"> PAGEREF _Toc239103036 \h </w:instrText>
+          <w:instrText xml:space="preserve"> PAGEREF _Toc239454471 \h </w:instrText>
         </w:r>
         <w:r>
           <w:rPr>
@@ -7681,7 +7681,7 @@
             <w:noProof/>
             <w:webHidden/>
           </w:rPr>
-          <w:t>29</w:t>
+          <w:t>30</w:t>
         </w:r>
         <w:r>
           <w:rPr>
@@ -7708,7 +7708,7 @@
           <w14:ligatures w14:val="standardContextual"/>
         </w:rPr>
       </w:pPr>
-      <w:hyperlink w:anchor="_Toc239103037" w:history="1">
+      <w:hyperlink w:anchor="_Toc239454472" w:history="1">
         <w:r>
           <w:rPr>
             <w:rStyle w:val="Hyperlink"/>
@@ -7736,7 +7736,7 @@
             <w:noProof/>
             <w:webHidden/>
           </w:rPr>
-          <w:instrText xml:space="preserve"> PAGEREF _Toc239103037 \h </w:instrText>
+          <w:instrText xml:space="preserve"> PAGEREF _Toc239454472 \h </w:instrText>
         </w:r>
         <w:r>
           <w:rPr>
@@ -7756,7 +7756,7 @@
             <w:noProof/>
             <w:webHidden/>
           </w:rPr>
-          <w:t>31</w:t>
+          <w:t>32</w:t>
         </w:r>
         <w:r>
           <w:rPr>
@@ -7783,7 +7783,7 @@
           <w14:ligatures w14:val="standardContextual"/>
         </w:rPr>
       </w:pPr>
-      <w:hyperlink w:anchor="_Toc239103038" w:history="1">
+      <w:hyperlink w:anchor="_Toc239454473" w:history="1">
         <w:r>
           <w:rPr>
             <w:rStyle w:val="Hyperlink"/>
@@ -7811,7 +7811,7 @@
             <w:noProof/>
             <w:webHidden/>
           </w:rPr>
-          <w:instrText xml:space="preserve"> PAGEREF _Toc239103038 \h </w:instrText>
+          <w:instrText xml:space="preserve"> PAGEREF _Toc239454473 \h </w:instrText>
         </w:r>
         <w:r>
           <w:rPr>
@@ -7831,7 +7831,7 @@
             <w:noProof/>
             <w:webHidden/>
           </w:rPr>
-          <w:t>33</w:t>
+          <w:t>34</w:t>
         </w:r>
         <w:r>
           <w:rPr>
@@ -7858,7 +7858,7 @@
           <w14:ligatures w14:val="standardContextual"/>
         </w:rPr>
       </w:pPr>
-      <w:hyperlink w:anchor="_Toc239103039" w:history="1">
+      <w:hyperlink w:anchor="_Toc239454474" w:history="1">
         <w:r>
           <w:rPr>
             <w:rStyle w:val="Hyperlink"/>
@@ -7886,7 +7886,7 @@
             <w:noProof/>
             <w:webHidden/>
           </w:rPr>
-          <w:instrText xml:space="preserve"> PAGEREF _Toc239103039 \h </w:instrText>
+          <w:instrText xml:space="preserve"> PAGEREF _Toc239454474 \h </w:instrText>
         </w:r>
         <w:r>
           <w:rPr>
@@ -7906,7 +7906,7 @@
             <w:noProof/>
             <w:webHidden/>
           </w:rPr>
-          <w:t>37</w:t>
+          <w:t>38</w:t>
         </w:r>
         <w:r>
           <w:rPr>
@@ -7933,7 +7933,7 @@
           <w14:ligatures w14:val="standardContextual"/>
         </w:rPr>
       </w:pPr>
-      <w:hyperlink w:anchor="_Toc239103040" w:history="1">
+      <w:hyperlink w:anchor="_Toc239454475" w:history="1">
         <w:r>
           <w:rPr>
             <w:rStyle w:val="Hyperlink"/>
@@ -7961,7 +7961,7 @@
             <w:noProof/>
             <w:webHidden/>
           </w:rPr>
-          <w:instrText xml:space="preserve"> PAGEREF _Toc239103040 \h </w:instrText>
+          <w:instrText xml:space="preserve"> PAGEREF _Toc239454475 \h </w:instrText>
         </w:r>
         <w:r>
           <w:rPr>
@@ -7981,7 +7981,7 @@
             <w:noProof/>
             <w:webHidden/>
           </w:rPr>
-          <w:t>38</w:t>
+          <w:t>39</w:t>
         </w:r>
         <w:r>
           <w:rPr>
@@ -8008,7 +8008,7 @@
           <w14:ligatures w14:val="standardContextual"/>
         </w:rPr>
       </w:pPr>
-      <w:hyperlink w:anchor="_Toc239103041" w:history="1">
+      <w:hyperlink w:anchor="_Toc239454476" w:history="1">
         <w:r>
           <w:rPr>
             <w:rStyle w:val="Hyperlink"/>
@@ -8036,7 +8036,7 @@
             <w:noProof/>
             <w:webHidden/>
           </w:rPr>
-          <w:instrText xml:space="preserve"> PAGEREF _Toc239103041 \h </w:instrText>
+          <w:instrText xml:space="preserve"> PAGEREF _Toc239454476 \h </w:instrText>
         </w:r>
         <w:r>
           <w:rPr>
@@ -8056,7 +8056,7 @@
             <w:noProof/>
             <w:webHidden/>
           </w:rPr>
-          <w:t>39</w:t>
+          <w:t>40</w:t>
         </w:r>
         <w:r>
           <w:rPr>
@@ -8083,7 +8083,7 @@
           <w14:ligatures w14:val="standardContextual"/>
         </w:rPr>
       </w:pPr>
-      <w:hyperlink w:anchor="_Toc239103042" w:history="1">
+      <w:hyperlink w:anchor="_Toc239454477" w:history="1">
         <w:r>
           <w:rPr>
             <w:rStyle w:val="Hyperlink"/>
@@ -8111,7 +8111,7 @@
             <w:noProof/>
             <w:webHidden/>
           </w:rPr>
-          <w:instrText xml:space="preserve"> PAGEREF _Toc239103042 \h </w:instrText>
+          <w:instrText xml:space="preserve"> PAGEREF _Toc239454477 \h </w:instrText>
         </w:r>
         <w:r>
           <w:rPr>
@@ -8131,7 +8131,7 @@
             <w:noProof/>
             <w:webHidden/>
           </w:rPr>
-          <w:t>39</w:t>
+          <w:t>40</w:t>
         </w:r>
         <w:r>
           <w:rPr>
@@ -8158,7 +8158,7 @@
           <w14:ligatures w14:val="standardContextual"/>
         </w:rPr>
       </w:pPr>
-      <w:hyperlink w:anchor="_Toc239103043" w:history="1">
+      <w:hyperlink w:anchor="_Toc239454478" w:history="1">
         <w:r>
           <w:rPr>
             <w:rStyle w:val="Hyperlink"/>
@@ -8186,7 +8186,7 @@
             <w:noProof/>
             <w:webHidden/>
           </w:rPr>
-          <w:instrText xml:space="preserve"> PAGEREF _Toc239103043 \h </w:instrText>
+          <w:instrText xml:space="preserve"> PAGEREF _Toc239454478 \h </w:instrText>
         </w:r>
         <w:r>
           <w:rPr>
@@ -8206,7 +8206,7 @@
             <w:noProof/>
             <w:webHidden/>
           </w:rPr>
-          <w:t>41</w:t>
+          <w:t>42</w:t>
         </w:r>
         <w:r>
           <w:rPr>
@@ -8233,7 +8233,7 @@
           <w14:ligatures w14:val="standardContextual"/>
         </w:rPr>
       </w:pPr>
-      <w:hyperlink w:anchor="_Toc239103044" w:history="1">
+      <w:hyperlink w:anchor="_Toc239454479" w:history="1">
         <w:r>
           <w:rPr>
             <w:rStyle w:val="Hyperlink"/>
@@ -8261,7 +8261,7 @@
             <w:noProof/>
             <w:webHidden/>
           </w:rPr>
-          <w:instrText xml:space="preserve"> PAGEREF _Toc239103044 \h </w:instrText>
+          <w:instrText xml:space="preserve"> PAGEREF _Toc239454479 \h </w:instrText>
         </w:r>
         <w:r>
           <w:rPr>
@@ -8281,7 +8281,7 @@
             <w:noProof/>
             <w:webHidden/>
           </w:rPr>
-          <w:t>41</w:t>
+          <w:t>42</w:t>
         </w:r>
         <w:r>
           <w:rPr>
@@ -8308,7 +8308,7 @@
           <w14:ligatures w14:val="standardContextual"/>
         </w:rPr>
       </w:pPr>
-      <w:hyperlink w:anchor="_Toc239103045" w:history="1">
+      <w:hyperlink w:anchor="_Toc239454480" w:history="1">
         <w:r>
           <w:rPr>
             <w:rStyle w:val="Hyperlink"/>
@@ -8336,7 +8336,7 @@
             <w:noProof/>
             <w:webHidden/>
           </w:rPr>
-          <w:instrText xml:space="preserve"> PAGEREF _Toc239103045 \h </w:instrText>
+          <w:instrText xml:space="preserve"> PAGEREF _Toc239454480 \h </w:instrText>
         </w:r>
         <w:r>
           <w:rPr>
@@ -8356,7 +8356,7 @@
             <w:noProof/>
             <w:webHidden/>
           </w:rPr>
-          <w:t>42</w:t>
+          <w:t>43</w:t>
         </w:r>
         <w:r>
           <w:rPr>
@@ -8383,7 +8383,7 @@
           <w14:ligatures w14:val="standardContextual"/>
         </w:rPr>
       </w:pPr>
-      <w:hyperlink w:anchor="_Toc239103046" w:history="1">
+      <w:hyperlink w:anchor="_Toc239454481" w:history="1">
         <w:r>
           <w:rPr>
             <w:rStyle w:val="Hyperlink"/>
@@ -8411,7 +8411,7 @@
             <w:noProof/>
             <w:webHidden/>
           </w:rPr>
-          <w:instrText xml:space="preserve"> PAGEREF _Toc239103046 \h </w:instrText>
+          <w:instrText xml:space="preserve"> PAGEREF _Toc239454481 \h </w:instrText>
         </w:r>
         <w:r>
           <w:rPr>
@@ -8431,7 +8431,7 @@
             <w:noProof/>
             <w:webHidden/>
           </w:rPr>
-          <w:t>43</w:t>
+          <w:t>44</w:t>
         </w:r>
         <w:r>
           <w:rPr>
@@ -9124,6 +9124,99 @@
         </w:tabs>
         <w:spacing w:after="0"/>
         <w:ind w:right="-393"/>
+        <w:jc w:val="both"/>
+        <w:rPr>
+          <w:rFonts w:ascii="Times New Roman" w:eastAsia="Times New Roman" w:hAnsi="Times New Roman" w:cs="Times New Roman"/>
+          <w:bCs/>
+          <w:szCs w:val="26"/>
+        </w:rPr>
+      </w:pPr>
+      <w:r>
+        <w:rPr>
+          <w:rFonts w:ascii="Times New Roman" w:eastAsia="Times New Roman" w:hAnsi="Times New Roman" w:cs="Times New Roman"/>
+          <w:bCs/>
+          <w:szCs w:val="26"/>
+        </w:rPr>
+        <w:tab/>
+      </w:r>
+      <w:r>
+        <w:rPr>
+          <w:rFonts w:ascii="Times New Roman" w:eastAsia="Times New Roman" w:hAnsi="Times New Roman" w:cs="Times New Roman"/>
+          <w:bCs/>
+          <w:szCs w:val="26"/>
+        </w:rPr>
+        <w:t>Đồ án tập trung phân tích và mô hình hóa hệ thống đặt lịch sửa chữa thiết bị (Booking) tại Daikin, trong đó một yêu cầu sửa chữa được xử lý qua nhiều bước và có sự phối hợp giữa khách hàng, bộ phận chăm sóc khách hàng, kỹ thuật viên, bộ phận quản lý và kho linh kiện. Với đặc điểm này, việc xác định rõ các quy trình và mối liên hệ giữa các bộ phận là cơ sở để đánh giá cách thức vận hành của hệ thống, đồng thời nhận diện những vấn đề có thể ảnh hưởng đến thời gian và chất lượng phục vụ.</w:t>
+      </w:r>
+    </w:p>
+    <w:p>
+      <w:pPr>
+        <w:tabs>
+          <w:tab w:val="left" w:pos="360"/>
+        </w:tabs>
+        <w:spacing w:after="0"/>
+        <w:ind w:right="-393"/>
+        <w:jc w:val="both"/>
+        <w:rPr>
+          <w:rFonts w:ascii="Times New Roman" w:eastAsia="Times New Roman" w:hAnsi="Times New Roman" w:cs="Times New Roman"/>
+          <w:bCs/>
+          <w:szCs w:val="26"/>
+        </w:rPr>
+      </w:pPr>
+      <w:r>
+        <w:rPr>
+          <w:rFonts w:ascii="Times New Roman" w:eastAsia="Times New Roman" w:hAnsi="Times New Roman" w:cs="Times New Roman"/>
+          <w:bCs/>
+          <w:szCs w:val="26"/>
+        </w:rPr>
+        <w:tab/>
+      </w:r>
+      <w:r>
+        <w:rPr>
+          <w:rFonts w:ascii="Times New Roman" w:eastAsia="Times New Roman" w:hAnsi="Times New Roman" w:cs="Times New Roman"/>
+          <w:bCs/>
+          <w:szCs w:val="26"/>
+        </w:rPr>
+        <w:t>Trong phạm vi đồ án, nhóm xác định 10 quy trình nghiệp vụ, được phân thành ba nhóm gồm Quản lý, Cốt lõi và Hỗ trợ. Các quy trình bao quát từ quản lý bảo hành thiết bị, quản lý kỹ thuật viên, quản lý chất lượng dịch vụ đến đặt booking, phân công kỹ thuật viên, tiếp nhận và xử lý booking, thanh toán, hỗ trợ và quản lý linh kiện. Từ danh sách này, nhóm lựa chọn 6 quy trình tiêu biểu để mô hình hóa chi tiết và tập trung phân tích sâu hai quy trình cốt lõi là CS assign KTV cho booking và KTV nhận và xử lý booking.</w:t>
+      </w:r>
+    </w:p>
+    <w:p>
+      <w:pPr>
+        <w:tabs>
+          <w:tab w:val="left" w:pos="360"/>
+        </w:tabs>
+        <w:spacing w:after="0"/>
+        <w:ind w:right="-393"/>
+        <w:jc w:val="both"/>
+        <w:rPr>
+          <w:rFonts w:ascii="Times New Roman" w:eastAsia="Times New Roman" w:hAnsi="Times New Roman" w:cs="Times New Roman"/>
+          <w:bCs/>
+          <w:szCs w:val="26"/>
+        </w:rPr>
+      </w:pPr>
+      <w:r>
+        <w:rPr>
+          <w:rFonts w:ascii="Times New Roman" w:eastAsia="Times New Roman" w:hAnsi="Times New Roman" w:cs="Times New Roman"/>
+          <w:bCs/>
+          <w:szCs w:val="26"/>
+        </w:rPr>
+        <w:tab/>
+      </w:r>
+      <w:r>
+        <w:rPr>
+          <w:rFonts w:ascii="Times New Roman" w:eastAsia="Times New Roman" w:hAnsi="Times New Roman" w:cs="Times New Roman"/>
+          <w:bCs/>
+          <w:szCs w:val="26"/>
+        </w:rPr>
+        <w:t>Để thực hiện đồ án, nhóm sử dụng phương pháp dựa trên bằng chứng kết hợp với phỏng vấn, khai thác các thông tin về thao tác trên hệ thống, vai trò của các bộ phận, trạng thái booking và các tình huống phát sinh trong quá trình xử lý. Sau khi mô hình hóa, nhóm đánh giá quy trình dựa trên các khía cạnh giá trị gia tăng, lãng phí, thời gian, chất lượng và chi phí. Kết quả phân tích cho thấy một số vấn đề đáng chú ý như khó tìm kỹ thuật viên phù hợp, tình trạng phải đi lại lần hai do thiếu linh kiện và các trường hợp booking bị kéo dài hoặc phát sinh khiếu nại. Trên cơ sở đó, nhóm đề xuất một số định hướng cải tiến nhằm giảm thời gian chờ, hạn chế phát sinh trong quá trình xử lý và nâng cao hiệu quả vận hành của hệ thống.</w:t>
+      </w:r>
+    </w:p>
+    <w:p>
+      <w:pPr>
+        <w:tabs>
+          <w:tab w:val="left" w:pos="360"/>
+        </w:tabs>
+        <w:spacing w:after="0"/>
+        <w:ind w:right="-393"/>
         <w:rPr>
           <w:rFonts w:ascii="Times New Roman" w:eastAsia="Times New Roman" w:hAnsi="Times New Roman" w:cs="Times New Roman"/>
           <w:b/>
@@ -9148,21 +9241,6 @@
     </w:p>
     <w:p>
       <w:pPr>
-        <w:tabs>
-          <w:tab w:val="left" w:pos="360"/>
-        </w:tabs>
-        <w:spacing w:after="0"/>
-        <w:ind w:right="-393"/>
-        <w:jc w:val="center"/>
-        <w:rPr>
-          <w:rFonts w:ascii="Times New Roman" w:eastAsia="Times New Roman" w:hAnsi="Times New Roman" w:cs="Times New Roman"/>
-          <w:b/>
-          <w:szCs w:val="26"/>
-        </w:rPr>
-      </w:pPr>
-    </w:p>
-    <w:p>
-      <w:pPr>
         <w:pStyle w:val="Title"/>
         <w:tabs>
           <w:tab w:val="left" w:pos="360"/>
@@ -9189,6 +9267,266 @@
         </w:rPr>
         <w:lastRenderedPageBreak/>
         <w:t>MỞ ĐẦU</w:t>
+      </w:r>
+    </w:p>
+    <w:p>
+      <w:pPr>
+        <w:tabs>
+          <w:tab w:val="left" w:pos="360"/>
+        </w:tabs>
+        <w:spacing w:after="0"/>
+        <w:ind w:right="-393"/>
+        <w:jc w:val="both"/>
+        <w:rPr>
+          <w:rFonts w:ascii="Times New Roman" w:eastAsia="Times New Roman" w:hAnsi="Times New Roman" w:cs="Times New Roman"/>
+          <w:szCs w:val="26"/>
+        </w:rPr>
+      </w:pPr>
+      <w:r>
+        <w:rPr>
+          <w:rFonts w:ascii="Times New Roman" w:eastAsia="Times New Roman" w:hAnsi="Times New Roman" w:cs="Times New Roman"/>
+          <w:szCs w:val="26"/>
+        </w:rPr>
+        <w:tab/>
+      </w:r>
+      <w:r>
+        <w:rPr>
+          <w:rFonts w:ascii="Times New Roman" w:eastAsia="Times New Roman" w:hAnsi="Times New Roman" w:cs="Times New Roman"/>
+          <w:szCs w:val="26"/>
+        </w:rPr>
+        <w:t>Trong hoạt động cung cấp dịch vụ sửa chữa và bảo trì thiết bị, một yêu cầu của khách hàng thường phải trải qua nhiều bước xử lý và có sự phối hợp giữa nhiều bộ phận như chăm sóc khách hàng, kỹ thuật viên, bộ phận quản lý và kho linh kiện. Từ khi tiếp nhận yêu cầu, phân công kỹ thuật viên, xử lý thiết bị cho đến thanh toán và hoàn tất booking, mỗi bước đều có những điều kiện và tình huống phát sinh khác nhau. Do đó, việc xác định và mô hình hóa rõ các quy trình nghiệp vụ có vai trò quan trọng trong việc giúp doanh nghiệp theo dõi cách thức vận hành, kiểm soát tiến độ và nhận diện những điểm có thể ảnh hưởng đến chất lượng dịch vụ.</w:t>
+      </w:r>
+    </w:p>
+    <w:p>
+      <w:pPr>
+        <w:tabs>
+          <w:tab w:val="left" w:pos="360"/>
+        </w:tabs>
+        <w:spacing w:after="0"/>
+        <w:ind w:right="-393"/>
+        <w:jc w:val="both"/>
+        <w:rPr>
+          <w:rFonts w:ascii="Times New Roman" w:eastAsia="Times New Roman" w:hAnsi="Times New Roman" w:cs="Times New Roman"/>
+          <w:szCs w:val="26"/>
+        </w:rPr>
+      </w:pPr>
+      <w:r>
+        <w:rPr>
+          <w:rFonts w:ascii="Times New Roman" w:eastAsia="Times New Roman" w:hAnsi="Times New Roman" w:cs="Times New Roman"/>
+          <w:szCs w:val="26"/>
+        </w:rPr>
+        <w:tab/>
+      </w:r>
+      <w:r>
+        <w:rPr>
+          <w:rFonts w:ascii="Times New Roman" w:eastAsia="Times New Roman" w:hAnsi="Times New Roman" w:cs="Times New Roman"/>
+          <w:szCs w:val="26"/>
+        </w:rPr>
+        <w:t>Xuất phát từ thực tế đó, nhóm thực hiện đề tài “Phân tích và mô hình hóa quy trình nghiệp vụ hệ thống đặt lịch sửa chữa thiết bị (Booking) tại Daikin” với mục tiêu tìm hiểu và mô tả cách một yêu cầu sửa chữa được xử lý xuyên suốt trong hệ thống. Trong phạm vi nghiên cứu, nhóm xác định 10 quy trình nghiệp vụ, được phân thành ba nhóm gồm Quản lý, Cốt lõi và Hỗ trợ. Các quy trình bao quát những hoạt động từ quản lý bảo hành thiết bị, quản lý kỹ thuật viên, quản lý chất lượng dịch vụ đến đặt booking, phân công và xử lý booking, thanh toán, hỗ trợ và quản lý linh kiện. Trên cơ sở đó, nhóm lựa chọn 6 quy trình tiêu biểu để mô hình hóa chi tiết, đồng thời tập trung phân tích hai quy trình cốt lõi là CS assign KTV cho booking và KTV nhận và xử lý booking.</w:t>
+      </w:r>
+    </w:p>
+    <w:p>
+      <w:pPr>
+        <w:tabs>
+          <w:tab w:val="left" w:pos="360"/>
+        </w:tabs>
+        <w:spacing w:after="0"/>
+        <w:ind w:right="-393"/>
+        <w:jc w:val="both"/>
+        <w:rPr>
+          <w:rFonts w:ascii="Times New Roman" w:eastAsia="Times New Roman" w:hAnsi="Times New Roman" w:cs="Times New Roman"/>
+          <w:szCs w:val="26"/>
+        </w:rPr>
+      </w:pPr>
+      <w:r>
+        <w:rPr>
+          <w:rFonts w:ascii="Times New Roman" w:eastAsia="Times New Roman" w:hAnsi="Times New Roman" w:cs="Times New Roman"/>
+          <w:szCs w:val="26"/>
+        </w:rPr>
+        <w:tab/>
+      </w:r>
+      <w:r>
+        <w:rPr>
+          <w:rFonts w:ascii="Times New Roman" w:eastAsia="Times New Roman" w:hAnsi="Times New Roman" w:cs="Times New Roman"/>
+          <w:szCs w:val="26"/>
+        </w:rPr>
+        <w:t>Để thực hiện đề tài, nhóm sử dụng phương pháp dựa trên bằng chứng kết hợp với phỏng vấn, tập trung khai thác các thông tin liên quan đến hoạt động của các bộ phận, thao tác trên hệ thống, trạng thái booking và các tình huống phát sinh trong quá trình xử lý. Các quy trình sau đó được mô hình hóa nhằm thể hiện sự tham gia của từng tác nhân, trình tự hoạt động và các điểm ra quyết định. Trên cơ sở mô hình, nhóm tiếp tục phân tích quy trình theo các khía cạnh giá trị gia tăng, lãng phí, thời gian, chất lượng và chi phí, từ đó nhận diện những điểm còn hạn chế và đề xuất một số hướng cải tiến phù hợp.</w:t>
+      </w:r>
+    </w:p>
+    <w:p>
+      <w:pPr>
+        <w:tabs>
+          <w:tab w:val="left" w:pos="360"/>
+        </w:tabs>
+        <w:spacing w:after="0"/>
+        <w:ind w:right="-393"/>
+        <w:jc w:val="both"/>
+        <w:rPr>
+          <w:rFonts w:ascii="Times New Roman" w:eastAsia="Times New Roman" w:hAnsi="Times New Roman" w:cs="Times New Roman"/>
+          <w:szCs w:val="26"/>
+        </w:rPr>
+      </w:pPr>
+      <w:r>
+        <w:rPr>
+          <w:rFonts w:ascii="Times New Roman" w:eastAsia="Times New Roman" w:hAnsi="Times New Roman" w:cs="Times New Roman"/>
+          <w:szCs w:val="26"/>
+        </w:rPr>
+        <w:tab/>
+      </w:r>
+      <w:r>
+        <w:rPr>
+          <w:rFonts w:ascii="Times New Roman" w:eastAsia="Times New Roman" w:hAnsi="Times New Roman" w:cs="Times New Roman"/>
+          <w:szCs w:val="26"/>
+        </w:rPr>
+        <w:t xml:space="preserve">Nội dung báo cáo được triển khai qua 5 </w:t>
+      </w:r>
+      <w:r>
+        <w:rPr>
+          <w:rFonts w:ascii="Times New Roman" w:eastAsia="Times New Roman" w:hAnsi="Times New Roman" w:cs="Times New Roman"/>
+          <w:szCs w:val="26"/>
+        </w:rPr>
+        <w:t>chương:</w:t>
+      </w:r>
+    </w:p>
+    <w:p>
+      <w:pPr>
+        <w:tabs>
+          <w:tab w:val="left" w:pos="360"/>
+        </w:tabs>
+        <w:spacing w:after="0"/>
+        <w:ind w:right="-393"/>
+        <w:jc w:val="both"/>
+        <w:rPr>
+          <w:rFonts w:ascii="Times New Roman" w:eastAsia="Times New Roman" w:hAnsi="Times New Roman" w:cs="Times New Roman"/>
+          <w:szCs w:val="26"/>
+        </w:rPr>
+      </w:pPr>
+      <w:r>
+        <w:rPr>
+          <w:rFonts w:ascii="Times New Roman" w:eastAsia="Times New Roman" w:hAnsi="Times New Roman" w:cs="Times New Roman"/>
+          <w:szCs w:val="26"/>
+        </w:rPr>
+        <w:tab/>
+      </w:r>
+      <w:r>
+        <w:rPr>
+          <w:rFonts w:ascii="Times New Roman" w:eastAsia="Times New Roman" w:hAnsi="Times New Roman" w:cs="Times New Roman"/>
+          <w:szCs w:val="26"/>
+        </w:rPr>
+        <w:t xml:space="preserve">Chương 1 trình bày danh sách và cách phân loại các quy trình nghiệp vụ của hệ thống. </w:t>
+      </w:r>
+    </w:p>
+    <w:p>
+      <w:pPr>
+        <w:tabs>
+          <w:tab w:val="left" w:pos="360"/>
+        </w:tabs>
+        <w:spacing w:after="0"/>
+        <w:ind w:right="-393"/>
+        <w:jc w:val="both"/>
+        <w:rPr>
+          <w:rFonts w:ascii="Times New Roman" w:eastAsia="Times New Roman" w:hAnsi="Times New Roman" w:cs="Times New Roman"/>
+          <w:szCs w:val="26"/>
+        </w:rPr>
+      </w:pPr>
+      <w:r>
+        <w:rPr>
+          <w:rFonts w:ascii="Times New Roman" w:eastAsia="Times New Roman" w:hAnsi="Times New Roman" w:cs="Times New Roman"/>
+          <w:szCs w:val="26"/>
+        </w:rPr>
+        <w:lastRenderedPageBreak/>
+        <w:tab/>
+      </w:r>
+      <w:r>
+        <w:rPr>
+          <w:rFonts w:ascii="Times New Roman" w:eastAsia="Times New Roman" w:hAnsi="Times New Roman" w:cs="Times New Roman"/>
+          <w:szCs w:val="26"/>
+        </w:rPr>
+        <w:t xml:space="preserve">Chương 2 trình bày việc mô hình hóa các quy trình được lựa chọn. </w:t>
+      </w:r>
+    </w:p>
+    <w:p>
+      <w:pPr>
+        <w:tabs>
+          <w:tab w:val="left" w:pos="360"/>
+        </w:tabs>
+        <w:spacing w:after="0"/>
+        <w:ind w:right="-393"/>
+        <w:jc w:val="both"/>
+        <w:rPr>
+          <w:rFonts w:ascii="Times New Roman" w:eastAsia="Times New Roman" w:hAnsi="Times New Roman" w:cs="Times New Roman"/>
+          <w:szCs w:val="26"/>
+        </w:rPr>
+      </w:pPr>
+      <w:r>
+        <w:rPr>
+          <w:rFonts w:ascii="Times New Roman" w:eastAsia="Times New Roman" w:hAnsi="Times New Roman" w:cs="Times New Roman"/>
+          <w:szCs w:val="26"/>
+        </w:rPr>
+        <w:tab/>
+      </w:r>
+      <w:r>
+        <w:rPr>
+          <w:rFonts w:ascii="Times New Roman" w:eastAsia="Times New Roman" w:hAnsi="Times New Roman" w:cs="Times New Roman"/>
+          <w:szCs w:val="26"/>
+        </w:rPr>
+        <w:t xml:space="preserve">Chương 3 giới thiệu phương pháp và cách thức nhóm thực hiện đề tài. </w:t>
+      </w:r>
+    </w:p>
+    <w:p>
+      <w:pPr>
+        <w:tabs>
+          <w:tab w:val="left" w:pos="360"/>
+        </w:tabs>
+        <w:spacing w:after="0"/>
+        <w:ind w:right="-393"/>
+        <w:jc w:val="both"/>
+        <w:rPr>
+          <w:rFonts w:ascii="Times New Roman" w:eastAsia="Times New Roman" w:hAnsi="Times New Roman" w:cs="Times New Roman"/>
+          <w:szCs w:val="26"/>
+        </w:rPr>
+      </w:pPr>
+      <w:r>
+        <w:rPr>
+          <w:rFonts w:ascii="Times New Roman" w:eastAsia="Times New Roman" w:hAnsi="Times New Roman" w:cs="Times New Roman"/>
+          <w:szCs w:val="26"/>
+        </w:rPr>
+        <w:tab/>
+      </w:r>
+      <w:r>
+        <w:rPr>
+          <w:rFonts w:ascii="Times New Roman" w:eastAsia="Times New Roman" w:hAnsi="Times New Roman" w:cs="Times New Roman"/>
+          <w:szCs w:val="26"/>
+        </w:rPr>
+        <w:t xml:space="preserve">Chương 4 tập trung phân tích hai quy trình cốt lõi dựa trên các tiêu chí về giá trị, lãng phí, thời gian, chất lượng và chi phí. </w:t>
+      </w:r>
+    </w:p>
+    <w:p>
+      <w:pPr>
+        <w:tabs>
+          <w:tab w:val="left" w:pos="360"/>
+        </w:tabs>
+        <w:spacing w:after="0"/>
+        <w:ind w:right="-393"/>
+        <w:jc w:val="both"/>
+        <w:rPr>
+          <w:rFonts w:ascii="Times New Roman" w:eastAsia="Times New Roman" w:hAnsi="Times New Roman" w:cs="Times New Roman"/>
+          <w:szCs w:val="26"/>
+        </w:rPr>
+      </w:pPr>
+      <w:r>
+        <w:rPr>
+          <w:rFonts w:ascii="Times New Roman" w:eastAsia="Times New Roman" w:hAnsi="Times New Roman" w:cs="Times New Roman"/>
+          <w:szCs w:val="26"/>
+        </w:rPr>
+        <w:tab/>
+      </w:r>
+      <w:r>
+        <w:rPr>
+          <w:rFonts w:ascii="Times New Roman" w:eastAsia="Times New Roman" w:hAnsi="Times New Roman" w:cs="Times New Roman"/>
+          <w:szCs w:val="26"/>
+        </w:rPr>
+        <w:t>Chương 5 tổng hợp những kết quả đạt được, các hạn chế của đồ án và định hướng cải tiến trong thời gian tới.</w:t>
       </w:r>
     </w:p>
     <w:p>
@@ -12938,7 +13276,7 @@
           <w:szCs w:val="14"/>
         </w:rPr>
       </w:pPr>
-      <w:bookmarkStart w:id="26" w:name="_Toc239103033"/>
+      <w:bookmarkStart w:id="26" w:name="_Toc239454468"/>
       <w:r>
         <w:rPr>
           <w:rFonts w:ascii="Times New Roman" w:hAnsi="Times New Roman" w:cs="Times New Roman"/>
@@ -13070,7 +13408,27 @@
           <w:sz w:val="22"/>
           <w:szCs w:val="14"/>
         </w:rPr>
-        <w:t>. Độ phức tạp quy trình - Quản lý KTV</w:t>
+        <w:t xml:space="preserve">. Độ phức tạp quy trình </w:t>
+      </w:r>
+      <w:r>
+        <w:rPr>
+          <w:rFonts w:ascii="Times New Roman" w:hAnsi="Times New Roman" w:cs="Times New Roman"/>
+          <w:i/>
+          <w:iCs/>
+          <w:sz w:val="22"/>
+          <w:szCs w:val="14"/>
+        </w:rPr>
+        <w:t xml:space="preserve">– </w:t>
+      </w:r>
+      <w:r>
+        <w:rPr>
+          <w:rFonts w:ascii="Times New Roman" w:hAnsi="Times New Roman" w:cs="Times New Roman"/>
+          <w:i/>
+          <w:iCs/>
+          <w:sz w:val="22"/>
+          <w:szCs w:val="14"/>
+        </w:rPr>
+        <w:t>Quản lý KTV</w:t>
       </w:r>
       <w:bookmarkEnd w:id="26"/>
     </w:p>
@@ -13527,7 +13885,7 @@
           <w:szCs w:val="14"/>
         </w:rPr>
       </w:pPr>
-      <w:bookmarkStart w:id="29" w:name="_Toc239103034"/>
+      <w:bookmarkStart w:id="29" w:name="_Toc239454469"/>
       <w:r>
         <w:rPr>
           <w:rFonts w:ascii="Times New Roman" w:hAnsi="Times New Roman" w:cs="Times New Roman"/>
@@ -14154,7 +14512,7 @@
           <w:szCs w:val="14"/>
         </w:rPr>
       </w:pPr>
-      <w:bookmarkStart w:id="33" w:name="_Toc239103035"/>
+      <w:bookmarkStart w:id="33" w:name="_Toc239454470"/>
       <w:r>
         <w:rPr>
           <w:rFonts w:ascii="Times New Roman" w:hAnsi="Times New Roman" w:cs="Times New Roman"/>
@@ -14749,7 +15107,7 @@
           <w:szCs w:val="14"/>
         </w:rPr>
       </w:pPr>
-      <w:bookmarkStart w:id="36" w:name="_Toc239103036"/>
+      <w:bookmarkStart w:id="36" w:name="_Toc239454471"/>
       <w:r>
         <w:rPr>
           <w:rFonts w:ascii="Times New Roman" w:hAnsi="Times New Roman" w:cs="Times New Roman"/>
@@ -15364,7 +15722,7 @@
           <w:szCs w:val="14"/>
         </w:rPr>
       </w:pPr>
-      <w:bookmarkStart w:id="40" w:name="_Toc239103037"/>
+      <w:bookmarkStart w:id="40" w:name="_Toc239454472"/>
       <w:r>
         <w:rPr>
           <w:rFonts w:ascii="Times New Roman" w:hAnsi="Times New Roman" w:cs="Times New Roman"/>
@@ -15971,7 +16329,7 @@
           <w:szCs w:val="14"/>
         </w:rPr>
       </w:pPr>
-      <w:bookmarkStart w:id="43" w:name="_Toc239103038"/>
+      <w:bookmarkStart w:id="43" w:name="_Toc239454473"/>
       <w:r>
         <w:rPr>
           <w:rFonts w:ascii="Times New Roman" w:hAnsi="Times New Roman" w:cs="Times New Roman"/>
@@ -17284,7 +17642,7 @@
           <w:szCs w:val="14"/>
         </w:rPr>
       </w:pPr>
-      <w:bookmarkStart w:id="60" w:name="_Toc239103039"/>
+      <w:bookmarkStart w:id="60" w:name="_Toc239454474"/>
       <w:r>
         <w:rPr>
           <w:rFonts w:ascii="Times New Roman" w:hAnsi="Times New Roman" w:cs="Times New Roman"/>
@@ -17989,7 +18347,7 @@
           <w:szCs w:val="14"/>
         </w:rPr>
       </w:pPr>
-      <w:bookmarkStart w:id="61" w:name="_Toc239103040"/>
+      <w:bookmarkStart w:id="61" w:name="_Toc239454475"/>
       <w:r>
         <w:rPr>
           <w:rFonts w:ascii="Times New Roman" w:hAnsi="Times New Roman" w:cs="Times New Roman"/>
@@ -18701,7 +19059,7 @@
           <w:szCs w:val="14"/>
         </w:rPr>
       </w:pPr>
-      <w:bookmarkStart w:id="63" w:name="_Toc239103041"/>
+      <w:bookmarkStart w:id="63" w:name="_Toc239454476"/>
       <w:r>
         <w:rPr>
           <w:rFonts w:ascii="Times New Roman" w:hAnsi="Times New Roman" w:cs="Times New Roman"/>
@@ -19177,7 +19535,7 @@
           <w:szCs w:val="14"/>
         </w:rPr>
       </w:pPr>
-      <w:bookmarkStart w:id="64" w:name="_Toc239103042"/>
+      <w:bookmarkStart w:id="64" w:name="_Toc239454477"/>
       <w:r>
         <w:rPr>
           <w:rFonts w:ascii="Times New Roman" w:hAnsi="Times New Roman" w:cs="Times New Roman"/>
@@ -19998,7 +20356,7 @@
           <w:szCs w:val="14"/>
         </w:rPr>
       </w:pPr>
-      <w:bookmarkStart w:id="69" w:name="_Toc239103043"/>
+      <w:bookmarkStart w:id="69" w:name="_Toc239454478"/>
       <w:r>
         <w:rPr>
           <w:rFonts w:ascii="Times New Roman" w:hAnsi="Times New Roman" w:cs="Times New Roman"/>
@@ -20622,7 +20980,7 @@
           <w:szCs w:val="14"/>
         </w:rPr>
       </w:pPr>
-      <w:bookmarkStart w:id="70" w:name="_Toc239103044"/>
+      <w:bookmarkStart w:id="70" w:name="_Toc239454479"/>
       <w:r>
         <w:rPr>
           <w:rFonts w:ascii="Times New Roman" w:hAnsi="Times New Roman" w:cs="Times New Roman"/>
@@ -21287,7 +21645,7 @@
           <w:szCs w:val="14"/>
         </w:rPr>
       </w:pPr>
-      <w:bookmarkStart w:id="72" w:name="_Toc239103045"/>
+      <w:bookmarkStart w:id="72" w:name="_Toc239454480"/>
       <w:r>
         <w:rPr>
           <w:rFonts w:ascii="Times New Roman" w:hAnsi="Times New Roman" w:cs="Times New Roman"/>
@@ -21811,7 +22169,7 @@
           <w:szCs w:val="14"/>
         </w:rPr>
       </w:pPr>
-      <w:bookmarkStart w:id="74" w:name="_Toc239103046"/>
+      <w:bookmarkStart w:id="74" w:name="_Toc239454481"/>
       <w:r>
         <w:rPr>
           <w:rFonts w:ascii="Times New Roman" w:hAnsi="Times New Roman" w:cs="Times New Roman"/>
@@ -23771,7 +24129,6 @@
   <w:style w:type="character" w:default="1" w:styleId="DefaultParagraphFont">
     <w:name w:val="Default Paragraph Font"/>
     <w:uiPriority w:val="1"/>
-    <w:semiHidden/>
     <w:unhideWhenUsed/>
   </w:style>
   <w:style w:type="table" w:default="1" w:styleId="TableNormal">

</xml_diff>